<commit_message>
Record Docking, Airplane entry, and stage report evidence
</commit_message>
<xml_diff>
--- a/docs/evidence/results/archcomp26_20261001/stage_report/ARCHCOMP26_STAGE_REPORT_DRAFT_20261001.docx
+++ b/docs/evidence/results/archcomp26_20261001/stage_report/ARCHCOMP26_STAGE_REPORT_DRAFT_20261001.docx
@@ -53,7 +53,7 @@
     </w:p>
     <w:p>
       <w:r>
-        <w:t>目标是在同一 benchmark 合同下，比较 PyTorch/GPU、Huan、Xiangru 和 Flow* native 对 16 个非 VCAS 实例的完整性、全进程时间及绝对 flowpipe 宽度；计划矩阵为 16×4，共 64 个 cell。当前有 20 个方法单元的完整数值时域记录，其中 ACC participant-order、两物理态 Single Pendulum 与修正危险盒的 Attitude 各有四方完整时域记录；四方矩阵仍未完成。</w:t>
+        <w:t>目标是在同一 benchmark 合同下，比较 PyTorch/GPU、Huan、Xiangru 和 Flow* native 对 16 个非 VCAS 实例的完整性、全进程时间及绝对 flowpipe 宽度；计划矩阵为 16×4，共 64 个 cell。当前有 24 个方法单元的完整数值时域记录，其中 ACC participant-order、两物理态 Single Pendulum、修正危险盒的 Attitude 与 Docking 各有四方完整时域记录；Docking 性质未决，四方矩阵仍未完成。</w:t>
       </w:r>
     </w:p>
     <w:p>
@@ -63,7 +63,7 @@
     </w:p>
     <w:p>
       <w:r>
-        <w:t>两物理态 Single Pendulum 的四方各完成 1×100 子步，P3 的 50 个性质窗口安全事件与保存 tube 均在带内；这不是官方三物理态 MATLAB 复现。TORA remain 原生与 P3 各完成 12×200，Huan/Xiangru 仅有 t≤18.4 的共同全盒接受且保存 tube 安全前缀。DP more 三方未完成 T=0.4，P3 的 DP less 未完成 225 盒全程。ACC 四方各完成完整初盒的 50 控制期，并额外各有 1+5 次独立新进程计时；修正官方 unsafe 盒后的 Attitude 四方各完成 30 期、60 小段。保存区间、作者 checker 输出和图均不构成独立端到端浮点 NNCS 证明。</w:t>
+        <w:t>两物理态 Single Pendulum 的四方各完成 1×100 子步，P3 的 50 个性质窗口安全事件与保存 tube 均在带内；这不是官方三物理态 MATLAB 复现。TORA remain 原生与 P3 各完成 12×200，Huan/Xiangru 仅有 t≤18.4 的共同全盒接受且保存 tube 安全前缀。DP more 三方未完成 T=0.4，P3 的 DP less 未完成 225 盒全程。ACC 四方各完成完整初盒的 50 控制期，并额外各有 1+5 次独立新进程计时；修正官方 unsafe 盒后的 Attitude 四方各完成 30 期、60 小段。Docking 四方各完成 40 期、400 小段，但全时非线性安全性质均为 Unknown；Airplane continuous 全初盒四方入口均未得到首个接受小步。保存区间、作者 checker 输出和图均不构成独立端到端浮点 NNCS 证明。</w:t>
       </w:r>
     </w:p>
     <w:p>
@@ -429,6 +429,19 @@
         <w:tc>
           <w:tcPr>
             <w:tcW w:type="dxa" w:w="3269"/>
+            <w:tcBorders>
+              <w:top w:val="single" w:color="D9D9D9" w:sz="5"/>
+              <w:left w:val="single" w:color="D9D9D9" w:sz="5"/>
+              <w:bottom w:val="single" w:color="D9D9D9" w:sz="5"/>
+              <w:right w:val="single" w:color="D9D9D9" w:sz="5"/>
+            </w:tcBorders>
+            <w:tcMar>
+              <w:top w:w="95" w:type="dxa"/>
+              <w:left w:w="95" w:type="dxa"/>
+              <w:bottom w:w="95" w:type="dxa"/>
+              <w:right w:w="95" w:type="dxa"/>
+            </w:tcMar>
+            <w:shd w:fill="F6F9FC"/>
           </w:tcPr>
           <w:p>
             <w:r>
@@ -439,6 +452,19 @@
         <w:tc>
           <w:tcPr>
             <w:tcW w:type="dxa" w:w="3269"/>
+            <w:tcBorders>
+              <w:top w:val="single" w:color="D9D9D9" w:sz="5"/>
+              <w:left w:val="single" w:color="D9D9D9" w:sz="5"/>
+              <w:bottom w:val="single" w:color="D9D9D9" w:sz="5"/>
+              <w:right w:val="single" w:color="D9D9D9" w:sz="5"/>
+            </w:tcBorders>
+            <w:tcMar>
+              <w:top w:w="95" w:type="dxa"/>
+              <w:left w:w="95" w:type="dxa"/>
+              <w:bottom w:w="95" w:type="dxa"/>
+              <w:right w:w="95" w:type="dxa"/>
+            </w:tcMar>
+            <w:shd w:fill="F6F9FC"/>
           </w:tcPr>
           <w:p>
             <w:r>
@@ -449,6 +475,19 @@
         <w:tc>
           <w:tcPr>
             <w:tcW w:type="dxa" w:w="3269"/>
+            <w:tcBorders>
+              <w:top w:val="single" w:color="D9D9D9" w:sz="5"/>
+              <w:left w:val="single" w:color="D9D9D9" w:sz="5"/>
+              <w:bottom w:val="single" w:color="D9D9D9" w:sz="5"/>
+              <w:right w:val="single" w:color="D9D9D9" w:sz="5"/>
+            </w:tcBorders>
+            <w:tcMar>
+              <w:top w:w="95" w:type="dxa"/>
+              <w:left w:w="95" w:type="dxa"/>
+              <w:bottom w:w="95" w:type="dxa"/>
+              <w:right w:w="95" w:type="dxa"/>
+            </w:tcMar>
+            <w:shd w:fill="F6F9FC"/>
           </w:tcPr>
           <w:p>
             <w:r>
@@ -600,6 +639,155 @@
         <w:tc>
           <w:tcPr>
             <w:tcW w:type="dxa" w:w="3269"/>
+            <w:tcBorders>
+              <w:top w:val="single" w:color="D9D9D9" w:sz="5"/>
+              <w:left w:val="single" w:color="D9D9D9" w:sz="5"/>
+              <w:bottom w:val="single" w:color="D9D9D9" w:sz="5"/>
+              <w:right w:val="single" w:color="D9D9D9" w:sz="5"/>
+            </w:tcBorders>
+            <w:tcMar>
+              <w:top w:w="95" w:type="dxa"/>
+              <w:left w:w="95" w:type="dxa"/>
+              <w:bottom w:w="95" w:type="dxa"/>
+              <w:right w:w="95" w:type="dxa"/>
+            </w:tcMar>
+          </w:tcPr>
+          <w:p>
+            <w:r>
+              <w:t>Docking · 完整初盒 · 四方新 2026</w:t>
+            </w:r>
+          </w:p>
+        </w:tc>
+        <w:tc>
+          <w:tcPr>
+            <w:tcW w:type="dxa" w:w="3269"/>
+            <w:tcBorders>
+              <w:top w:val="single" w:color="D9D9D9" w:sz="5"/>
+              <w:left w:val="single" w:color="D9D9D9" w:sz="5"/>
+              <w:bottom w:val="single" w:color="D9D9D9" w:sz="5"/>
+              <w:right w:val="single" w:color="D9D9D9" w:sz="5"/>
+            </w:tcBorders>
+            <w:tcMar>
+              <w:top w:w="95" w:type="dxa"/>
+              <w:left w:w="95" w:type="dxa"/>
+              <w:bottom w:w="95" w:type="dxa"/>
+              <w:right w:w="95" w:type="dxa"/>
+            </w:tcMar>
+          </w:tcPr>
+          <w:p>
+            <w:r>
+              <w:t>各 1 盒 × 40 期 × 10 小段；T=40</w:t>
+            </w:r>
+          </w:p>
+        </w:tc>
+        <w:tc>
+          <w:tcPr>
+            <w:tcW w:type="dxa" w:w="3269"/>
+            <w:tcBorders>
+              <w:top w:val="single" w:color="D9D9D9" w:sz="5"/>
+              <w:left w:val="single" w:color="D9D9D9" w:sz="5"/>
+              <w:bottom w:val="single" w:color="D9D9D9" w:sz="5"/>
+              <w:right w:val="single" w:color="D9D9D9" w:sz="5"/>
+            </w:tcBorders>
+            <w:tcMar>
+              <w:top w:w="95" w:type="dxa"/>
+              <w:left w:w="95" w:type="dxa"/>
+              <w:bottom w:w="95" w:type="dxa"/>
+              <w:right w:w="95" w:type="dxa"/>
+            </w:tcMar>
+          </w:tcPr>
+          <w:p>
+            <w:r>
+              <w:t>四方各完成 400 段数值时域，非线性全时性质均 Unknown；原生 outer exit 2 如实保留，未将区间相交当实际反例。</w:t>
+            </w:r>
+          </w:p>
+        </w:tc>
+      </w:tr>
+      <w:tr>
+        <w:tc>
+          <w:tcPr>
+            <w:tcW w:type="dxa" w:w="3269"/>
+            <w:tcBorders>
+              <w:top w:val="single" w:color="D9D9D9" w:sz="5"/>
+              <w:left w:val="single" w:color="D9D9D9" w:sz="5"/>
+              <w:bottom w:val="single" w:color="D9D9D9" w:sz="5"/>
+              <w:right w:val="single" w:color="D9D9D9" w:sz="5"/>
+            </w:tcBorders>
+            <w:tcMar>
+              <w:top w:w="95" w:type="dxa"/>
+              <w:left w:w="95" w:type="dxa"/>
+              <w:bottom w:w="95" w:type="dxa"/>
+              <w:right w:w="95" w:type="dxa"/>
+            </w:tcMar>
+          </w:tcPr>
+          <w:p>
+            <w:r>
+              <w:t>Airplane continuous · 完整初盒入口</w:t>
+            </w:r>
+          </w:p>
+        </w:tc>
+        <w:tc>
+          <w:tcPr>
+            <w:tcW w:type="dxa" w:w="3269"/>
+            <w:tcBorders>
+              <w:top w:val="single" w:color="D9D9D9" w:sz="5"/>
+              <w:left w:val="single" w:color="D9D9D9" w:sz="5"/>
+              <w:bottom w:val="single" w:color="D9D9D9" w:sz="5"/>
+              <w:right w:val="single" w:color="D9D9D9" w:sz="5"/>
+            </w:tcBorders>
+            <w:tcMar>
+              <w:top w:w="95" w:type="dxa"/>
+              <w:left w:w="95" w:type="dxa"/>
+              <w:bottom w:w="95" w:type="dxa"/>
+              <w:right w:w="95" w:type="dxa"/>
+            </w:tcMar>
+          </w:tcPr>
+          <w:p>
+            <w:r>
+              <w:t>12 物理态单盒；目标 20 期，T=2</w:t>
+            </w:r>
+          </w:p>
+        </w:tc>
+        <w:tc>
+          <w:tcPr>
+            <w:tcW w:type="dxa" w:w="3269"/>
+            <w:tcBorders>
+              <w:top w:val="single" w:color="D9D9D9" w:sz="5"/>
+              <w:left w:val="single" w:color="D9D9D9" w:sz="5"/>
+              <w:bottom w:val="single" w:color="D9D9D9" w:sz="5"/>
+              <w:right w:val="single" w:color="D9D9D9" w:sz="5"/>
+            </w:tcBorders>
+            <w:tcMar>
+              <w:top w:w="95" w:type="dxa"/>
+              <w:left w:w="95" w:type="dxa"/>
+              <w:bottom w:w="95" w:type="dxa"/>
+              <w:right w:w="95" w:type="dxa"/>
+            </w:tcMar>
+          </w:tcPr>
+          <w:p>
+            <w:r>
+              <w:t>Huan order 6 资源阻断；Huan/Xiangru order 3、P3 严格同阶及 native 均首步未接受；P3 另一验证设置在建表时溢出。无完整数值结果。</w:t>
+            </w:r>
+          </w:p>
+        </w:tc>
+      </w:tr>
+      <w:tr>
+        <w:tc>
+          <w:tcPr>
+            <w:tcW w:type="dxa" w:w="3269"/>
+            <w:tcBorders>
+              <w:top w:val="single" w:color="D9D9D9" w:sz="5"/>
+              <w:left w:val="single" w:color="D9D9D9" w:sz="5"/>
+              <w:bottom w:val="single" w:color="D9D9D9" w:sz="5"/>
+              <w:right w:val="single" w:color="D9D9D9" w:sz="5"/>
+            </w:tcBorders>
+            <w:tcMar>
+              <w:top w:w="95" w:type="dxa"/>
+              <w:left w:w="95" w:type="dxa"/>
+              <w:bottom w:w="95" w:type="dxa"/>
+              <w:right w:w="95" w:type="dxa"/>
+            </w:tcMar>
+            <w:shd w:fill="F6F9FC"/>
           </w:tcPr>
           <w:p>
             <w:r>
@@ -610,6 +798,19 @@
         <w:tc>
           <w:tcPr>
             <w:tcW w:type="dxa" w:w="3269"/>
+            <w:tcBorders>
+              <w:top w:val="single" w:color="D9D9D9" w:sz="5"/>
+              <w:left w:val="single" w:color="D9D9D9" w:sz="5"/>
+              <w:bottom w:val="single" w:color="D9D9D9" w:sz="5"/>
+              <w:right w:val="single" w:color="D9D9D9" w:sz="5"/>
+            </w:tcBorders>
+            <w:tcMar>
+              <w:top w:w="95" w:type="dxa"/>
+              <w:left w:w="95" w:type="dxa"/>
+              <w:bottom w:w="95" w:type="dxa"/>
+              <w:right w:w="95" w:type="dxa"/>
+            </w:tcMar>
+            <w:shd w:fill="F6F9FC"/>
           </w:tcPr>
           <w:p>
             <w:r>
@@ -620,6 +821,19 @@
         <w:tc>
           <w:tcPr>
             <w:tcW w:type="dxa" w:w="3269"/>
+            <w:tcBorders>
+              <w:top w:val="single" w:color="D9D9D9" w:sz="5"/>
+              <w:left w:val="single" w:color="D9D9D9" w:sz="5"/>
+              <w:bottom w:val="single" w:color="D9D9D9" w:sz="5"/>
+              <w:right w:val="single" w:color="D9D9D9" w:sz="5"/>
+            </w:tcBorders>
+            <w:tcMar>
+              <w:top w:w="95" w:type="dxa"/>
+              <w:left w:w="95" w:type="dxa"/>
+              <w:bottom w:w="95" w:type="dxa"/>
+              <w:right w:w="95" w:type="dxa"/>
+            </w:tcMar>
+            <w:shd w:fill="F6F9FC"/>
           </w:tcPr>
           <w:p>
             <w:r>
@@ -926,11 +1140,6 @@
           <w:rFonts w:ascii="Arial Unicode MS" w:hAnsi="Arial Unicode MS" w:eastAsia="Arial Unicode MS"/>
         </w:rPr>
         <w:t>失败前缀、单盒 smoke、不同模型和不同安全语义不外推为完整时域结果。宽度必须报告绝对上下界、union width 和分区 mean/max。</w:t>
-      </w:r>
-    </w:p>
-    <w:p>
-      <w:r>
-        <w:br w:type="page"/>
       </w:r>
     </w:p>
     <w:p>
@@ -3112,11 +3321,6 @@
       </w:r>
     </w:p>
     <w:p>
-      <w:r>
-        <w:br w:type="page"/>
-      </w:r>
-    </w:p>
-    <w:p>
       <w:pPr>
         <w:pStyle w:val="Heading1"/>
       </w:pPr>
@@ -3186,7 +3390,7 @@
         <w:pStyle w:val="ListBullet"/>
       </w:pPr>
       <w:r>
-        <w:t>两物理态 Single Pendulum 四方已有单次全程，但与官方三物理态 MATLAB 合同不同；TORA 原生/P3 完整与 Huan/Xiangru 晚期拒绝的性质语义须并列报告。Attitude 修正 unsafe 后四方单次全程均已记录，仍需复核端到端证明资格。其他实例仍须逐项冻结合同并记录尝试。</w:t>
+        <w:t>两物理态 Single Pendulum 四方已有单次全程，但与官方三物理态 MATLAB 合同不同；TORA 原生/P3 完整与 Huan/Xiangru 晚期拒绝的性质语义须并列报告。Attitude 修正 unsafe 后四方单次全程均已记录；Docking 四方也完成数值时域但性质 Unknown。Airplane continuous 的完整初盒四方入口遇到资源、编码容量或首小步拒绝。其他实例仍须逐项冻结合同并记录尝试。</w:t>
       </w:r>
     </w:p>
     <w:p>
@@ -3214,11 +3418,6 @@
     <w:p>
       <w:r>
         <w:t>ACC 在明确命名的 participant-order 合同下已有四方单次完整数值记录，但没有稳定四方速度排名。保存区间、图和作者 checker verdict 不是独立端到端浮点证明。TORA Huan/Xiangru 的区间出带不是独立实际轨迹反例；失败进程时间也不是 T=20 完成时间。路径与配置只作来源说明，未与记录内容绑定；旧冻结证据仍仅为历史参照。</w:t>
-      </w:r>
-    </w:p>
-    <w:p>
-      <w:r>
-        <w:br w:type="page"/>
       </w:r>
     </w:p>
     <w:p>
@@ -5191,6 +5390,103 @@
     <w:p>
       <w:pPr>
         <w:pStyle w:val="Heading1"/>
+      </w:pPr>
+      <w:r>
+        <w:t>13  Docking · 完整初盒四方数值时域</w:t>
+      </w:r>
+    </w:p>
+    <w:p>
+      <w:pPr/>
+      <w:r>
+        <w:t>固定 2026 合同以一盒 [70,106]²×[−0.28,0.28]² 覆盖四态 (sx,sy,vx,vy)，控制器原始四态输入、两力输出，1 s 保持并更新 40 期。四方各记录 400 个 0.1 s 全时 tube；外层进程 wall 为 P3 17.411771 s、Huan 12.698839 s、Xiangru 12.668129 s、原生 9.139416 s，均只有一个完整进程样本。原生 wrapper 的原始状态是 failed/exit 2，原因是全时性质 UNKNOWN；数值日志独立显示 40/40 期、400 tubes、40 RPC，不可把外层状态改写成 VERIFIED。</w:t>
+      </w:r>
+    </w:p>
+    <w:p>
+      <w:pPr/>
+      <w:r>
+        <w:t>全时安全性质为 q=√(vx²+vy²)−0.2−0.002054√(sx²+sy²)≤0。初盒 q 上界约 −0.007356；首段 [0,0.1] 的四方保守 q 上界均约 +0.016083。四方的 400 段保存 tube 盒检查均不能证明 q≤0；盒与 q&gt;0 侧相交不构成实际轨迹反例。原生末段最大 q 上界 +8.954347，其余三方约 +8.806 至 +8.808。四方末时绝对区间、原生上下仿射斜率一致性与原始 RESULT 见 DOCKING_FULLBOX_3METHODS_SUMMARY.md、native_docking_full40_001/SUMMARY.md。</w:t>
+      </w:r>
+    </w:p>
+    <w:p>
+      <w:pPr>
+        <w:keepNext/>
+        <w:jc w:val="center"/>
+      </w:pPr>
+      <w:r>
+        <w:drawing>
+          <wp:inline xmlns:a="http://schemas.openxmlformats.org/drawingml/2006/main" xmlns:pic="http://schemas.openxmlformats.org/drawingml/2006/picture">
+            <wp:extent cx="6048000" cy="3395368"/>
+            <wp:docPr id="5" name="Picture 5"/>
+            <wp:cNvGraphicFramePr>
+              <a:graphicFrameLocks noChangeAspect="1"/>
+            </wp:cNvGraphicFramePr>
+            <a:graphic>
+              <a:graphicData uri="http://schemas.openxmlformats.org/drawingml/2006/picture">
+                <pic:pic>
+                  <pic:nvPicPr>
+                    <pic:cNvPr id="0" name="docking_fullbox_4method_q_upper.png"/>
+                    <pic:cNvPicPr/>
+                  </pic:nvPicPr>
+                  <pic:blipFill>
+                    <a:blip r:embed="rId15"/>
+                    <a:stretch>
+                      <a:fillRect/>
+                    </a:stretch>
+                  </pic:blipFill>
+                  <pic:spPr>
+                    <a:xfrm>
+                      <a:off x="0" y="0"/>
+                      <a:ext cx="6048000" cy="3395368"/>
+                    </a:xfrm>
+                    <a:prstGeom prst="rect"/>
+                  </pic:spPr>
+                </pic:pic>
+              </a:graphicData>
+            </a:graphic>
+          </wp:inline>
+        </w:drawing>
+      </w:r>
+    </w:p>
+    <w:p>
+      <w:pPr>
+        <w:pStyle w:val="Caption"/>
+        <w:keepNext/>
+      </w:pPr>
+      <w:r>
+        <w:t>图 5  Docking 四方保存 tube 的 q 上界；绿色为 q≤0 安全区域，内框放大第一秒。</w:t>
+      </w:r>
+    </w:p>
+    <w:p>
+      <w:pPr>
+        <w:pStyle w:val="Note"/>
+      </w:pPr>
+      <w:r>
+        <w:t>每条曲线来自完整初盒保存的 400 个区间，不是轨迹或安全证明。原生外层 exit 2 与四方 Unknown 均保留；图源与 MATLAB 脚本在 plots/nohash_saved_20261001，MATLAB 未实跑。</w:t>
+      </w:r>
+    </w:p>
+    <w:p>
+      <w:pPr>
+        <w:pStyle w:val="Heading1"/>
+      </w:pPr>
+      <w:r>
+        <w:t>14  Airplane continuous · 完整初盒四方入口阻断</w:t>
+      </w:r>
+    </w:p>
+    <w:p>
+      <w:pPr/>
+      <w:r>
+        <w:t>固定官方连续版把 (u,v,w,phi,theta,psi) 六维设为 [0,1]，其余六物理态为零，且只给一个未分割初盒；控制器 12 输入、6 输出，20 个 0.1 s 周期至 T=2。全时要求 y、phi、theta、psi∈[−1,1]。旧点初盒的四方成绩不覆盖该盒。Huan 的 order 6 一期尝试在零 ODE 小步前因 19 变量六阶单项式配对表导致 RSS 超过 54,006,540 KiB 而停；独立 order 3 诊断中 Huan/Xiangru 均在首个 0.01 s 小步拒绝唯一全初盒，接受数为零。三次外层 wall 分别为 252.247、6.785、6.985 s，均非完整 T=2 性能样本。</w:t>
+      </w:r>
+    </w:p>
+    <w:p>
+      <w:pPr/>
+      <w:r>
+        <w:t>P3 严格 solution_plus_one 首次新 smoke 在建验证 P4 表时发生 64 位整数编码溢出，0 段接受，wall 13.757866 s；另一新 run 使用引擎现有的严格同阶 solution_order 验证，首个 0.01 s 小步 accepted=false，0/10 段接受，wall 12.500084 s。Flow* native 独立 order 6 和 order 3 smoke 均在首个 0.01 s 小步返回 status 4=UNCOMPLETED_SAFE，0 flowpipes，外层 failed/exit 2；wall 分别为 4.877421 和 3.925546 s。order 3 把先验 remainder 从 [−0.01,0.01] 扩至 [−1,1] 的额外诊断仍在首步返回 status 4，这个改参结果不属于官方基线。均没有全时 tube 或性质结论，失败时间不能作完整性能比较；P3 内部拒绝细因未记录。原始摘要见 airplane_continuous_order3_fullbox_20261002/SUMMARY.md、AIRPLANE_P3_FULLBOX_SMOKES_20261002.md 与 native_airplane_fullbox_smokes_20261002/SUMMARY.md。</w:t>
+      </w:r>
+    </w:p>
+    <w:p>
+      <w:pPr>
+        <w:pStyle w:val="Heading1"/>
         <w:pageBreakBefore/>
       </w:pPr>
       <w:r>
@@ -5202,7 +5498,7 @@
     </w:p>
     <w:p>
       <w:r>
-        <w:t>“全程”表示本轮一个方法完成目标时域；“诊断”表示短程入口尝试；“早停”或“未知”表示未完成。ACC、两物理态 Single Pendulum、Attitude 修正后各四方及 TORA 原生/P3 等共 20 格有完整记录，距离 64 格矩阵仍有缺口。ACC 另有 24 次独立新进程 campaign；其计时中位数不构成稳定速度排名。TORA Huan/Xiangru 虽记录至第 200 小步，但部分盒步拒绝，故列为“未知·前缀”。</w:t>
+        <w:t>“全程”表示本轮一个方法完成目标数值时域，并不自动表示性质已证明；“诊断”表示短程入口尝试；“早停”或“未知”表示未完成。ACC、两物理态 Single Pendulum、Attitude 修正后、Docking 各四方及 TORA 原生/P3 等共 24 格有完整记录，距离 64 格矩阵仍有缺口。Docking 原生的 outer RESULT 是 failed/exit 2，原因是 checker Unknown，数值仍完成 400 段。ACC 另有 24 次独立新进程 campaign；其计时中位数不构成稳定速度排名。TORA Huan/Xiangru 虽记录至第 200 小步，但部分盒步拒绝，故列为“未知·前缀”。</w:t>
       </w:r>
     </w:p>
     <w:tbl>
@@ -5509,18 +5805,8 @@
             <w:shd w:fill="F7F8FA"/>
           </w:tcPr>
           <w:p>
-            <w:pPr>
-              <w:spacing w:after="0" w:before="0" w:line="252" w:lineRule="auto"/>
-            </w:pPr>
-            <w:r/>
             <w:r>
-              <w:rPr>
-                <w:rFonts w:ascii="Arial Unicode MS" w:hAnsi="Arial Unicode MS" w:eastAsia="Arial Unicode MS"/>
-                <w:b w:val="0"/>
-                <w:color w:val="1F2937"/>
-                <w:sz w:val="16"/>
-              </w:rPr>
-              <w:t>待</w:t>
+              <w:t>失败</w:t>
             </w:r>
           </w:p>
         </w:tc>
@@ -5537,18 +5823,8 @@
             <w:shd w:fill="F7F8FA"/>
           </w:tcPr>
           <w:p>
-            <w:pPr>
-              <w:spacing w:after="0" w:before="0" w:line="252" w:lineRule="auto"/>
-            </w:pPr>
-            <w:r/>
             <w:r>
-              <w:rPr>
-                <w:rFonts w:ascii="Arial Unicode MS" w:hAnsi="Arial Unicode MS" w:eastAsia="Arial Unicode MS"/>
-                <w:b w:val="0"/>
-                <w:color w:val="1F2937"/>
-                <w:sz w:val="16"/>
-              </w:rPr>
-              <w:t>待</w:t>
+              <w:t>失败</w:t>
             </w:r>
           </w:p>
         </w:tc>
@@ -5565,18 +5841,8 @@
             <w:shd w:fill="F7F8FA"/>
           </w:tcPr>
           <w:p>
-            <w:pPr>
-              <w:spacing w:after="0" w:before="0" w:line="252" w:lineRule="auto"/>
-            </w:pPr>
-            <w:r/>
             <w:r>
-              <w:rPr>
-                <w:rFonts w:ascii="Arial Unicode MS" w:hAnsi="Arial Unicode MS" w:eastAsia="Arial Unicode MS"/>
-                <w:b w:val="0"/>
-                <w:color w:val="1F2937"/>
-                <w:sz w:val="16"/>
-              </w:rPr>
-              <w:t>待</w:t>
+              <w:t>失败</w:t>
             </w:r>
           </w:p>
         </w:tc>
@@ -5593,18 +5859,8 @@
             <w:shd w:fill="F7F8FA"/>
           </w:tcPr>
           <w:p>
-            <w:pPr>
-              <w:spacing w:after="0" w:before="0" w:line="252" w:lineRule="auto"/>
-            </w:pPr>
-            <w:r/>
             <w:r>
-              <w:rPr>
-                <w:rFonts w:ascii="Arial Unicode MS" w:hAnsi="Arial Unicode MS" w:eastAsia="Arial Unicode MS"/>
-                <w:b w:val="0"/>
-                <w:color w:val="1F2937"/>
-                <w:sz w:val="16"/>
-              </w:rPr>
-              <w:t>待</w:t>
+              <w:t>失败</w:t>
             </w:r>
           </w:p>
         </w:tc>
@@ -6039,18 +6295,8 @@
             <w:shd w:fill="F7F8FA"/>
           </w:tcPr>
           <w:p>
-            <w:pPr>
-              <w:spacing w:after="0" w:before="0" w:line="252" w:lineRule="auto"/>
-            </w:pPr>
-            <w:r/>
             <w:r>
-              <w:rPr>
-                <w:rFonts w:ascii="Arial Unicode MS" w:hAnsi="Arial Unicode MS" w:eastAsia="Arial Unicode MS"/>
-                <w:b w:val="0"/>
-                <w:color w:val="1F2937"/>
-                <w:sz w:val="16"/>
-              </w:rPr>
-              <w:t>待</w:t>
+              <w:t>全程·性质未知</w:t>
             </w:r>
           </w:p>
         </w:tc>
@@ -6067,18 +6313,8 @@
             <w:shd w:fill="F7F8FA"/>
           </w:tcPr>
           <w:p>
-            <w:pPr>
-              <w:spacing w:after="0" w:before="0" w:line="252" w:lineRule="auto"/>
-            </w:pPr>
-            <w:r/>
             <w:r>
-              <w:rPr>
-                <w:rFonts w:ascii="Arial Unicode MS" w:hAnsi="Arial Unicode MS" w:eastAsia="Arial Unicode MS"/>
-                <w:b w:val="0"/>
-                <w:color w:val="1F2937"/>
-                <w:sz w:val="16"/>
-              </w:rPr>
-              <w:t>待</w:t>
+              <w:t>全程·性质未知</w:t>
             </w:r>
           </w:p>
         </w:tc>
@@ -6095,18 +6331,8 @@
             <w:shd w:fill="F7F8FA"/>
           </w:tcPr>
           <w:p>
-            <w:pPr>
-              <w:spacing w:after="0" w:before="0" w:line="252" w:lineRule="auto"/>
-            </w:pPr>
-            <w:r/>
             <w:r>
-              <w:rPr>
-                <w:rFonts w:ascii="Arial Unicode MS" w:hAnsi="Arial Unicode MS" w:eastAsia="Arial Unicode MS"/>
-                <w:b w:val="0"/>
-                <w:color w:val="1F2937"/>
-                <w:sz w:val="16"/>
-              </w:rPr>
-              <w:t>待</w:t>
+              <w:t>全程·性质未知</w:t>
             </w:r>
           </w:p>
         </w:tc>
@@ -6123,18 +6349,8 @@
             <w:shd w:fill="F7F8FA"/>
           </w:tcPr>
           <w:p>
-            <w:pPr>
-              <w:spacing w:after="0" w:before="0" w:line="252" w:lineRule="auto"/>
-            </w:pPr>
-            <w:r/>
             <w:r>
-              <w:rPr>
-                <w:rFonts w:ascii="Arial Unicode MS" w:hAnsi="Arial Unicode MS" w:eastAsia="Arial Unicode MS"/>
-                <w:b w:val="0"/>
-                <w:color w:val="1F2937"/>
-                <w:sz w:val="16"/>
-              </w:rPr>
-              <w:t>待</w:t>
+              <w:t>全程·性质未知</w:t>
             </w:r>
           </w:p>
         </w:tc>
@@ -7871,6 +8087,90 @@
         <w:rPr>
           <w:sz w:val="15"/>
         </w:rPr>
+        <w:t>results/archcomp26_20261001/DOCKING_FULLBOX_3METHODS_SUMMARY.md</w:t>
+      </w:r>
+    </w:p>
+    <w:p>
+      <w:pPr>
+        <w:pStyle w:val="Note"/>
+        <w:spacing w:after="20"/>
+      </w:pPr>
+      <w:r>
+        <w:rPr>
+          <w:sz w:val="15"/>
+        </w:rPr>
+        <w:t>results/archcomp26_20261001/native_docking_full40_001/SUMMARY.md</w:t>
+      </w:r>
+    </w:p>
+    <w:p>
+      <w:pPr>
+        <w:pStyle w:val="Note"/>
+        <w:spacing w:after="20"/>
+      </w:pPr>
+      <w:r>
+        <w:rPr>
+          <w:sz w:val="15"/>
+        </w:rPr>
+        <w:t>results/archcomp26_20261001/plots/nohash_saved_20261001/docking_fullbox_4method_q_upper.geometry.json</w:t>
+      </w:r>
+    </w:p>
+    <w:p>
+      <w:pPr>
+        <w:pStyle w:val="Note"/>
+        <w:spacing w:after="20"/>
+      </w:pPr>
+      <w:r>
+        <w:rPr>
+          <w:sz w:val="15"/>
+        </w:rPr>
+        <w:t>results/archcomp26_20261001/airplane_continuous_order3_fullbox_20261002/SUMMARY.md</w:t>
+      </w:r>
+    </w:p>
+    <w:p>
+      <w:pPr>
+        <w:pStyle w:val="Note"/>
+        <w:spacing w:after="20"/>
+      </w:pPr>
+      <w:r>
+        <w:rPr>
+          <w:sz w:val="15"/>
+        </w:rPr>
+        <w:t>results/archcomp26_20261001/AIRPLANE_P3_FULLBOX_SMOKES_20261002.md</w:t>
+      </w:r>
+    </w:p>
+    <w:p>
+      <w:pPr>
+        <w:pStyle w:val="Note"/>
+        <w:spacing w:after="20"/>
+      </w:pPr>
+      <w:r>
+        <w:rPr>
+          <w:sz w:val="15"/>
+        </w:rPr>
+        <w:t>results/archcomp26_20261001/native_airplane_fullbox_smokes_20261002/SUMMARY.md</w:t>
+      </w:r>
+    </w:p>
+    <w:p>
+      <w:pPr>
+        <w:pStyle w:val="Note"/>
+        <w:spacing w:after="20"/>
+      </w:pPr>
+      <w:r>
+        <w:rPr>
+          <w:sz w:val="15"/>
+        </w:rPr>
+        <w:t>results/huan_quad_stage_a_40_20261001/observer_pair_v1/SUMMARY.md</w:t>
+      </w:r>
+    </w:p>
+    <w:p>
+      <w:pPr>
+        <w:pStyle w:val="Note"/>
+        <w:spacing w:after="20"/>
+      </w:pPr>
+      <w:r>
+        <w:rPr>
+          <w:sz w:val="15"/>
+        </w:rPr>
         <w:t>output/flowstar_latest_20260930/repo/docs/ARCHCOMP26_ATTITUDE_CONTROL_CONTRACT_20261001.md</w:t>
       </w:r>
     </w:p>

</xml_diff>

<commit_message>
Record new ARCH-COMP26 bounded diagnostics and refresh stage report
</commit_message>
<xml_diff>
--- a/docs/evidence/results/archcomp26_20261001/stage_report/ARCHCOMP26_STAGE_REPORT_DRAFT_20261001.docx
+++ b/docs/evidence/results/archcomp26_20261001/stage_report/ARCHCOMP26_STAGE_REPORT_DRAFT_20261001.docx
@@ -53,7 +53,7 @@
     </w:p>
     <w:p>
       <w:r>
-        <w:t>目标是在同一 benchmark 合同下，比较 PyTorch/GPU、Huan、Xiangru 和 Flow* native 对 16 个非 VCAS 实例的完整性、全进程时间及绝对 flowpipe 宽度；计划矩阵为 16×4，共 64 个 cell。当前有 24 个方法单元的完整数值时域记录，其中 ACC participant-order、两物理态 Single Pendulum、修正危险盒的 Attitude 与 Docking 各有四方完整时域记录；Docking 性质未决，四方矩阵仍未完成。</w:t>
+        <w:t>目标是在同一 benchmark 合同下，比较 PyTorch/GPU、Huan、Xiangru 和 Flow* native 对 16 个非 VCAS 实例的完整性、全进程时间及绝对 flowpipe 宽度；计划矩阵为 16×4，共 64 个 cell。截至 103 条新尝试，25 个方法单元有完整数值时域记录，其中 DP less、ACC participant-order、两物理态 Single Pendulum、修正危险盒的 Attitude 与 Docking 各有四方完整时域记录；Docking 性质未决，四方矩阵仍未完成。</w:t>
       </w:r>
     </w:p>
     <w:p>
@@ -63,7 +63,7 @@
     </w:p>
     <w:p>
       <w:r>
-        <w:t>两物理态 Single Pendulum 的四方各完成 1×100 子步，P3 的 50 个性质窗口安全事件与保存 tube 均在带内；这不是官方三物理态 MATLAB 复现。TORA remain 原生与 P3 各完成 12×200，Huan/Xiangru 仅有 t≤18.4 的共同全盒接受且保存 tube 安全前缀。DP more 三方未完成 T=0.4，P3 的 DP less 未完成 225 盒全程。ACC 四方各完成完整初盒的 50 控制期，并额外各有 1+5 次独立新进程计时；修正官方 unsafe 盒后的 Attitude 四方各完成 30 期、60 小段。Docking 四方各完成 40 期、400 小段，但全时非线性安全性质均为 Unknown；Airplane continuous 全初盒四方入口均未得到首个接受小步。保存区间、作者 checker 输出和图均不构成独立端到端浮点 NNCS 证明。</w:t>
+        <w:t>两物理态 Single Pendulum 的四方各完成 1×100 子步，P3 的 50 个性质窗口安全事件与保存 tube 均在带内；这不是官方三物理态 MATLAB 复现。TORA remain 原生与 P3 各完成 12×200，Huan/Xiangru 仅有 t≤18.4 的共同全盒接受且保存 tube 安全前缀。DP less 的 P3 定向仿射四分控制 residual 新作业完成 225 盒、20 期、100 小步；DP more 三方仍未完成 T=0.4。ACC 四方各完成完整初盒的 50 控制期，并额外各有 1+5 次独立新进程计时；修正官方 unsafe 盒后的 Attitude 四方各完成 30 期、60 小段。Docking 四方各完成 40 期、400 小段，但全时非线性安全性质均为 Unknown；Airplane continuous 全初盒四方入口均未得到首个接受小步。保存区间、作者 checker 输出和图均不构成独立端到端浮点 NNCS 证明。</w:t>
       </w:r>
     </w:p>
     <w:p>
@@ -859,18 +859,8 @@
             <w:shd w:fill="F7F8FA"/>
           </w:tcPr>
           <w:p>
-            <w:pPr>
-              <w:spacing w:after="0" w:before="0" w:line="252" w:lineRule="auto"/>
-            </w:pPr>
-            <w:r/>
             <w:r>
-              <w:rPr>
-                <w:rFonts w:ascii="Arial Unicode MS" w:hAnsi="Arial Unicode MS" w:eastAsia="Arial Unicode MS"/>
-                <w:b w:val="0"/>
-                <w:color w:val="1F2937"/>
-                <w:sz w:val="17"/>
-              </w:rPr>
-              <w:t>DP less · P3 移植诊断 · 新 2026</w:t>
+              <w:t>DP less · P3 分区 residual · 新 2026</w:t>
             </w:r>
           </w:p>
         </w:tc>
@@ -887,18 +877,8 @@
             <w:shd w:fill="F7F8FA"/>
           </w:tcPr>
           <w:p>
-            <w:pPr>
-              <w:spacing w:after="0" w:before="0" w:line="252" w:lineRule="auto"/>
-            </w:pPr>
-            <w:r/>
             <w:r>
-              <w:rPr>
-                <w:rFonts w:ascii="Arial Unicode MS" w:hAnsi="Arial Unicode MS" w:eastAsia="Arial Unicode MS"/>
-                <w:b w:val="0"/>
-                <w:color w:val="1F2937"/>
-                <w:sz w:val="17"/>
-              </w:rPr>
-              <w:t>单盒 × 1 控制期 × 5 子步；早期单盒和 225 盒界逆序已记录</w:t>
+              <w:t>225 盒 × 20 期 × 5 子步；22,500/22,500 盒步接受</w:t>
             </w:r>
           </w:p>
         </w:tc>
@@ -915,18 +895,8 @@
             <w:shd w:fill="F7F8FA"/>
           </w:tcPr>
           <w:p>
-            <w:pPr>
-              <w:spacing w:after="0" w:before="0" w:line="252" w:lineRule="auto"/>
-            </w:pPr>
-            <w:r/>
             <w:r>
-              <w:rPr>
-                <w:rFonts w:ascii="Arial Unicode MS" w:hAnsi="Arial Unicode MS" w:eastAsia="Arial Unicode MS"/>
-                <w:b w:val="0"/>
-                <w:color w:val="1F2937"/>
-                <w:sz w:val="17"/>
-              </w:rPr>
-              <w:t>只说明短程入口可推进，不代表 225 盒或 T=1 全程。</w:t>
+              <w:t>新四分 residual 作业完成 T=1，全部保存 tube 在 Safe 带内；早期失败诊断仍单列。无稳定速度排名或端到端证书。</w:t>
             </w:r>
           </w:p>
         </w:tc>
@@ -3341,7 +3311,84 @@
     </w:p>
     <w:p>
       <w:r>
-        <w:t>新版首控制期的早期单盒和 225 盒入口，在 plant advance 前发现控制输出 1 的原始 CROWN 下界 L 大于上界 U，约差一个 binary64 ULP。随后采用独立有向区间 NN residual 包络的 smoke1_004 完成单盒、一个控制期和 5 个 ODE 子步；后续 225 盒诊断仍有 Unknown 与收缩失败。这些都是局部入口进展，不能写成 225 盒、20 期或 T=1 的完整结果。</w:t>
+        <w:t>早期 P3 入口发现控制输出的原始 CROWN 上下界相差约一个 binary64 ULP；整盒有向 residual 运行在 225 盒全程的第 48 小步首次性质未决，第 56 小步收缩失败。每维二分、16 子盒诊断分别推迟至第 75 与 84 小步，仍未完成。后来每维四分、256 个闭子盒的新独立尝试完成 100/100 小步及 22,500/22,500 盒步；这项成功单列，不覆盖早期失败记录。</w:t>
+      </w:r>
+    </w:p>
+    <w:p>
+      <w:pPr>
+        <w:pStyle w:val="Heading2"/>
+      </w:pPr>
+      <w:r>
+        <w:t>DP less 四方保存数值流管</w:t>
+      </w:r>
+    </w:p>
+    <w:p>
+      <w:pPr/>
+      <w:r>
+        <w:t>P3 的每维四分有向仿射控制 residual 仍使用原全局仿射图，并对 256 个覆盖输入盒的闭子盒 residual 取并后与独立保守界相交。新 run 完成 225 初盒 × 20 期 × 5 小步，22,500 个盒步均 accepted，外层 wall 74.274085 s。对 22,500 条保存 tube 的四物理态逐项扫描，均处于全时安全带 [−1.7,2]，最小盒裕量 +0.093919848；这是保存数值区间的安全检查，不是独立端到端浮点证明。</w:t>
+      </w:r>
+    </w:p>
+    <w:p>
+      <w:pPr/>
+      <w:r>
+        <w:t>四方法在 T=1 的第四物理态 endpoint union 宽为 P3 0.799090015、native 1.016584896、Huan/Xiangru 1.109787875；逐盒平均宽度并非同一次序。下图使用四方完整 225 盒保存 tube 的逐时刻 union，绿色安全带是全时性质，黑色初集位于 t=0；没有插值缺失步。P3 分区 residual 的计算成本与其它方法不同，单次 wall 不能给速度排名。四方绝对 lo/hi、16 行终点统计和 1600 行逐步范围见 dp_less_fourway_split4_20261002/SUMMARY.md、endpoint_stats.csv 与 tube_union.csv。</w:t>
+      </w:r>
+    </w:p>
+    <w:p>
+      <w:pPr>
+        <w:keepNext/>
+        <w:jc w:val="center"/>
+      </w:pPr>
+      <w:r>
+        <w:drawing>
+          <wp:inline xmlns:a="http://schemas.openxmlformats.org/drawingml/2006/main" xmlns:pic="http://schemas.openxmlformats.org/drawingml/2006/picture">
+            <wp:extent cx="6048000" cy="4207304"/>
+            <wp:docPr id="6" name="Picture 6"/>
+            <wp:cNvGraphicFramePr>
+              <a:graphicFrameLocks noChangeAspect="1"/>
+            </wp:cNvGraphicFramePr>
+            <a:graphic>
+              <a:graphicData uri="http://schemas.openxmlformats.org/drawingml/2006/picture">
+                <pic:pic>
+                  <pic:nvPicPr>
+                    <pic:cNvPr id="0" name="fourway_tube_union.png"/>
+                    <pic:cNvPicPr/>
+                  </pic:nvPicPr>
+                  <pic:blipFill>
+                    <a:blip r:embed="rId16"/>
+                    <a:stretch>
+                      <a:fillRect/>
+                    </a:stretch>
+                  </pic:blipFill>
+                  <pic:spPr>
+                    <a:xfrm>
+                      <a:off x="0" y="0"/>
+                      <a:ext cx="6048000" cy="4207304"/>
+                    </a:xfrm>
+                    <a:prstGeom prst="rect"/>
+                  </pic:spPr>
+                </pic:pic>
+              </a:graphicData>
+            </a:graphic>
+          </wp:inline>
+        </w:drawing>
+      </w:r>
+    </w:p>
+    <w:p>
+      <w:pPr>
+        <w:pStyle w:val="Caption"/>
+        <w:keepNext/>
+      </w:pPr>
+      <w:r>
+        <w:t>图 4  DP less 四方法完整 225 盒四态 tube union 与全时安全带。</w:t>
+      </w:r>
+    </w:p>
+    <w:p>
+      <w:pPr>
+        <w:pStyle w:val="Note"/>
+      </w:pPr>
+      <w:r>
+        <w:t>P3 四分 residual 的 100 个小步覆盖全部初盒；Huan/Xiangru 保存数组相同。图是区间外包络而非轨迹或端到端证明；同目录提供 PDF 与 MATLAB 脚本，MATLAB 未实跑。</w:t>
       </w:r>
     </w:p>
     <w:p>
@@ -3360,10 +3407,7 @@
         <w:pStyle w:val="ListBullet"/>
       </w:pPr>
       <w:r>
-        <w:rPr>
-          <w:rFonts w:ascii="Arial Unicode MS" w:hAnsi="Arial Unicode MS" w:eastAsia="Arial Unicode MS"/>
-        </w:rPr>
-        <w:t>DP less：P3 的 225 盒与 20 期全程，以及四方同资源、同计时边界的重复计时与宽度序列。</w:t>
+        <w:t>DP less：四方数值时域现已齐全；仍需统一资源与计时边界的重复测量，并建立完整浮点 NNCS 保证链。P3 新运行的 256 控制子盒 residual 改变了计算成本，不能拿单次 wall 作稳定速度排名。</w:t>
       </w:r>
     </w:p>
     <w:p>
@@ -5355,7 +5399,7 @@
         <w:keepNext/>
       </w:pPr>
       <w:r>
-        <w:t>图 4  ACC 四方每期 whole-tube 盒的保守 safe-distance margin；虚线为全时 margin=0 边界。</w:t>
+        <w:t>图 5  ACC 四方每期 whole-tube 盒的保守 safe-distance margin；虚线为全时 margin=0 边界。</w:t>
       </w:r>
     </w:p>
     <w:p>
@@ -5453,7 +5497,7 @@
         <w:keepNext/>
       </w:pPr>
       <w:r>
-        <w:t>图 5  Docking 四方保存 tube 的 q 上界；绿色为 q≤0 安全区域，内框放大第一秒。</w:t>
+        <w:t>图 6  Docking 四方保存 tube 的 q 上界；绿色为 q≤0 安全区域，内框放大第一秒。</w:t>
       </w:r>
     </w:p>
     <w:p>
@@ -5498,7 +5542,7 @@
     </w:p>
     <w:p>
       <w:r>
-        <w:t>“全程”表示本轮一个方法完成目标数值时域，并不自动表示性质已证明；“诊断”表示短程入口尝试；“早停”或“未知”表示未完成。ACC、两物理态 Single Pendulum、Attitude 修正后、Docking 各四方及 TORA 原生/P3 等共 24 格有完整记录，距离 64 格矩阵仍有缺口。Docking 原生的 outer RESULT 是 failed/exit 2，原因是 checker Unknown，数值仍完成 400 段。ACC 另有 24 次独立新进程 campaign；其计时中位数不构成稳定速度排名。TORA Huan/Xiangru 虽记录至第 200 小步，但部分盒步拒绝，故列为“未知·前缀”。</w:t>
+        <w:t>“全程”表示本轮一个方法完成目标数值时域，并不自动表示性质已证明；“诊断”表示短程入口尝试；“早停”或“未知”表示未完成。DP less、ACC、两物理态 Single Pendulum、Attitude 修正后、Docking 各四方及 TORA 原生/P3 等共 25 格有完整记录，距离 64 格矩阵仍有缺口。Docking 原生的 outer RESULT 是 failed/exit 2，原因是 checker Unknown，数值仍完成 400 段。ACC 另有 24 次独立新进程 campaign；其计时中位数不构成稳定速度排名。TORA Huan/Xiangru 虽记录至第 200 小步，但部分盒步拒绝，故列为“未知·前缀”。</w:t>
       </w:r>
     </w:p>
     <w:tbl>
@@ -6180,18 +6224,8 @@
             </w:tcBorders>
           </w:tcPr>
           <w:p>
-            <w:pPr>
-              <w:spacing w:after="0" w:before="0" w:line="252" w:lineRule="auto"/>
-            </w:pPr>
-            <w:r/>
             <w:r>
-              <w:rPr>
-                <w:rFonts w:ascii="Arial Unicode MS" w:hAnsi="Arial Unicode MS" w:eastAsia="Arial Unicode MS"/>
-                <w:b w:val="0"/>
-                <w:color w:val="1F2937"/>
-                <w:sz w:val="16"/>
-              </w:rPr>
-              <w:t>待</w:t>
+              <w:t>早停·仓库四输入</w:t>
             </w:r>
           </w:p>
         </w:tc>
@@ -6398,18 +6432,8 @@
             </w:tcBorders>
           </w:tcPr>
           <w:p>
-            <w:pPr>
-              <w:spacing w:after="0" w:before="0" w:line="252" w:lineRule="auto"/>
-            </w:pPr>
-            <w:r/>
             <w:r>
-              <w:rPr>
-                <w:rFonts w:ascii="Arial Unicode MS" w:hAnsi="Arial Unicode MS" w:eastAsia="Arial Unicode MS"/>
-                <w:b w:val="0"/>
-                <w:color w:val="1F2937"/>
-                <w:sz w:val="16"/>
-              </w:rPr>
-              <w:t>诊断</w:t>
+              <w:t>全程·分区 residual</w:t>
             </w:r>
           </w:p>
         </w:tc>
@@ -6710,18 +6734,8 @@
             </w:tcBorders>
           </w:tcPr>
           <w:p>
-            <w:pPr>
-              <w:spacing w:after="0" w:before="0" w:line="252" w:lineRule="auto"/>
-            </w:pPr>
-            <w:r/>
             <w:r>
-              <w:rPr>
-                <w:rFonts w:ascii="Arial Unicode MS" w:hAnsi="Arial Unicode MS" w:eastAsia="Arial Unicode MS"/>
-                <w:b w:val="0"/>
-                <w:color w:val="1F2937"/>
-                <w:sz w:val="16"/>
-              </w:rPr>
-              <w:t>待</w:t>
+              <w:t>首盒首周期</w:t>
             </w:r>
           </w:p>
         </w:tc>
@@ -6853,18 +6867,8 @@
             <w:shd w:fill="F7F8FA"/>
           </w:tcPr>
           <w:p>
-            <w:pPr>
-              <w:spacing w:after="0" w:before="0" w:line="252" w:lineRule="auto"/>
-            </w:pPr>
-            <w:r/>
             <w:r>
-              <w:rPr>
-                <w:rFonts w:ascii="Arial Unicode MS" w:hAnsi="Arial Unicode MS" w:eastAsia="Arial Unicode MS"/>
-                <w:b w:val="0"/>
-                <w:color w:val="1F2937"/>
-                <w:sz w:val="16"/>
-              </w:rPr>
-              <w:t>待</w:t>
+              <w:t>首盒首周期</w:t>
             </w:r>
           </w:p>
         </w:tc>
@@ -7029,18 +7033,8 @@
             </w:tcBorders>
           </w:tcPr>
           <w:p>
-            <w:pPr>
-              <w:spacing w:after="0" w:before="0" w:line="252" w:lineRule="auto"/>
-            </w:pPr>
-            <w:r/>
             <w:r>
-              <w:rPr>
-                <w:rFonts w:ascii="Arial Unicode MS" w:hAnsi="Arial Unicode MS" w:eastAsia="Arial Unicode MS"/>
-                <w:b w:val="0"/>
-                <w:color w:val="1F2937"/>
-                <w:sz w:val="16"/>
-              </w:rPr>
-              <w:t>待</w:t>
+              <w:t>运行中</w:t>
             </w:r>
           </w:p>
         </w:tc>
@@ -8160,6 +8154,30 @@
           <w:sz w:val="15"/>
         </w:rPr>
         <w:t>results/huan_quad_stage_a_40_20261001/observer_pair_v1/SUMMARY.md</w:t>
+      </w:r>
+    </w:p>
+    <w:p>
+      <w:pPr>
+        <w:pStyle w:val="Note"/>
+        <w:spacing w:after="20"/>
+      </w:pPr>
+      <w:r>
+        <w:rPr>
+          <w:sz w:val="15"/>
+        </w:rPr>
+        <w:t>results/archcomp26_20261001/dp_less_fourway_split4_20261002/SUMMARY.md</w:t>
+      </w:r>
+    </w:p>
+    <w:p>
+      <w:pPr>
+        <w:pStyle w:val="Note"/>
+        <w:spacing w:after="20"/>
+      </w:pPr>
+      <w:r>
+        <w:rPr>
+          <w:sz w:val="15"/>
+        </w:rPr>
+        <w:t>output/flowstar_latest_20260930/repo/docs/ARCHCOMP26_DP_P3_PARTITION_DIAGNOSTIC_20261002.md</w:t>
       </w:r>
     </w:p>
     <w:p>

</xml_diff>

<commit_message>
Record completed paper QUAD native run and four-way plot
</commit_message>
<xml_diff>
--- a/docs/evidence/results/archcomp26_20261001/stage_report/ARCHCOMP26_STAGE_REPORT_DRAFT_20261001.docx
+++ b/docs/evidence/results/archcomp26_20261001/stage_report/ARCHCOMP26_STAGE_REPORT_DRAFT_20261001.docx
@@ -53,17 +53,17 @@
     </w:p>
     <w:p>
       <w:r>
-        <w:t>目标是在同一 benchmark 合同下，比较 PyTorch/GPU、Huan、Xiangru 和 Flow* native 对 16 个非 VCAS 实例的完整性、全进程时间及绝对 flowpipe 宽度；计划矩阵为 16×4，共 64 个 cell。截至 103 条新尝试，25 个方法单元有完整数值时域记录，其中 DP less、ACC participant-order、两物理态 Single Pendulum、修正危险盒的 Attitude 与 Docking 各有四方完整时域记录；Docking 性质未决，四方矩阵仍未完成。</w:t>
+        <w:t>目标是在同一 benchmark 合同下，比较 PyTorch/GPU、Huan、Xiangru 和 Flow* native 对 16 个非 VCAS 实例的完整性、全进程时间及绝对 flowpipe 宽度；计划矩阵为 16×4，共 64 个 cell。截至 105 条新尝试，26 个方法单元有完整数值时域记录，其中 QUAD、DP less、ACC participant-order、两物理态 Single Pendulum、修正危险盒的 Attitude 与 Docking 各有四方完整时域记录；Docking 性质未决，四方矩阵仍未完成。</w:t>
       </w:r>
     </w:p>
     <w:p>
       <w:r>
-        <w:t>Double Pendulum less-robust 的新 Flow* native、Huan、Xiangru 均覆盖 225 初盒、20 控制期和 100 个 ODE 子步；单次进程 wall 分别为 1107.127423、9.539174、8.387790 s。保存 tube 在连续全时域安全带内。论文方程 QUAD P3/Huan/Xiangru 各覆盖 1024 初盒、50 期和 1000 子步，wall 分别为 1357.555、94.583、108.018 s；三方 T=5 的 x₃ endpoint 均在目标带内，驱动均打印 VERIFIED，其中 P3 的端到端严格证书字段为 false。</w:t>
+        <w:t>Double Pendulum less-robust 的新 Flow* native、Huan、Xiangru 均覆盖 225 初盒、20 控制期和 100 个 ODE 子步；单次进程 wall 分别为 1107.127423、9.539174、8.387790 s。保存 tube 在连续全时域安全带内。论文方程 QUAD 四方均有 1024 初盒、50 期、1000 子步的单次完整数值运行；P3/Huan/Xiangru/native 的进程 wall 分别为 1357.555、94.583、108.018、47058.887 s。四方 T=5 的 x₃ endpoint 均在目标带内，作者 checker 均打印 VERIFIED；这不是独立端到端浮点证明，也不构成稳定速度排名。</w:t>
       </w:r>
     </w:p>
     <w:p>
       <w:r>
-        <w:t>两物理态 Single Pendulum 的四方各完成 1×100 子步，P3 的 50 个性质窗口安全事件与保存 tube 均在带内；这不是官方三物理态 MATLAB 复现。TORA remain 原生与 P3 各完成 12×200，Huan/Xiangru 仅有 t≤18.4 的共同全盒接受且保存 tube 安全前缀。DP less 的 P3 定向仿射四分控制 residual 新作业完成 225 盒、20 期、100 小步；DP more 三方仍未完成 T=0.4。ACC 四方各完成完整初盒的 50 控制期，并额外各有 1+5 次独立新进程计时；修正官方 unsafe 盒后的 Attitude 四方各完成 30 期、60 小段。Docking 四方各完成 40 期、400 小段，但全时非线性安全性质均为 Unknown；Airplane continuous 全初盒四方入口均未得到首个接受小步。保存区间、作者 checker 输出和图均不构成独立端到端浮点 NNCS 证明。</w:t>
+        <w:t>两物理态 Single Pendulum 的四方各完成 1×100 子步，P3 的 50 个性质窗口安全事件与保存 tube 均在带内；这不是官方三物理态 MATLAB 复现。TORA remain 原生与 P3 各完成 12×200，Huan/Xiangru 仅有 t≤18.4 的共同全盒接受且保存 tube 安全前缀。DP less 的 P3 定向仿射四分控制 residual 新作业完成 225 盒、20 期、100 小步；DP more 四方均未完成 T=0.4，P3 仅有全 225 盒首周期数值前缀且性质 Unknown。ACC 四方各完成完整初盒的 50 控制期，并额外各有 1+5 次独立新进程计时；TORA reach-sigmoid 的 Huan 官方 u=11f 配置仅有完整初盒一期前缀、终点性质未检；修正官方 unsafe 盒后的 Attitude 四方各完成 30 期、60 小段。Docking 四方各完成 40 期、400 小段，但全时非线性安全性质均为 Unknown；Airplane continuous 全初盒四方入口均未得到首个接受小步。保存区间、作者 checker 输出和图均不构成独立端到端浮点 NNCS 证明。</w:t>
       </w:r>
     </w:p>
     <w:p>
@@ -386,7 +386,7 @@
           </w:tcPr>
           <w:p>
             <w:r>
-              <w:t>QUAD 论文方程 · P3/Huan/Xiangru · 新 2026</w:t>
+              <w:t>QUAD 论文方程 · 四方 · 新 2026</w:t>
             </w:r>
           </w:p>
         </w:tc>
@@ -403,7 +403,7 @@
           </w:tcPr>
           <w:p>
             <w:r>
-              <w:t>各 1024 盒 × 1000 子步；50 控制期；broken=0</w:t>
+              <w:t>各 1024 盒 × 1000 子步；50 控制期</w:t>
             </w:r>
           </w:p>
         </w:tc>
@@ -420,7 +420,7 @@
           </w:tcPr>
           <w:p>
             <w:r>
-              <w:t>单次 wall 1357.555 / 94.583 / 108.018 s；终点目标内；P3 严格证书 false。</w:t>
+              <w:t>四方单次全程；native 1,024,000 条范围重扫齐全，作者 VERIFIED；P3 严格证书 false。无稳定排名。</w:t>
             </w:r>
           </w:p>
         </w:tc>
@@ -917,18 +917,8 @@
             </w:tcBorders>
           </w:tcPr>
           <w:p>
-            <w:pPr>
-              <w:spacing w:after="0" w:before="0" w:line="252" w:lineRule="auto"/>
-            </w:pPr>
-            <w:r/>
             <w:r>
-              <w:rPr>
-                <w:rFonts w:ascii="Arial Unicode MS" w:hAnsi="Arial Unicode MS" w:eastAsia="Arial Unicode MS"/>
-                <w:b w:val="0"/>
-                <w:color w:val="1F2937"/>
-                <w:sz w:val="17"/>
-              </w:rPr>
-              <w:t>DP more · 三种方法 · 新 2026</w:t>
+              <w:t>DP more · 四方 · 新 2026</w:t>
             </w:r>
           </w:p>
         </w:tc>
@@ -944,18 +934,8 @@
             </w:tcBorders>
           </w:tcPr>
           <w:p>
-            <w:pPr>
-              <w:spacing w:after="0" w:before="0" w:line="252" w:lineRule="auto"/>
-            </w:pPr>
-            <w:r/>
             <w:r>
-              <w:rPr>
-                <w:rFonts w:ascii="Arial Unicode MS" w:hAnsi="Arial Unicode MS" w:eastAsia="Arial Unicode MS"/>
-                <w:b w:val="0"/>
-                <w:color w:val="1F2937"/>
-                <w:sz w:val="17"/>
-              </w:rPr>
-              <w:t>native 64/80 子步 UNKNOWN；Huan/Xiangru 各 72/80 子步 Unsafe.</w:t>
+              <w:t>native 64/80；Huan/Xiangru 各 72/80；P3 全 225 盒首周期</w:t>
             </w:r>
           </w:p>
         </w:tc>
@@ -971,18 +951,8 @@
             </w:tcBorders>
           </w:tcPr>
           <w:p>
-            <w:pPr>
-              <w:spacing w:after="0" w:before="0" w:line="252" w:lineRule="auto"/>
-            </w:pPr>
-            <w:r/>
             <w:r>
-              <w:rPr>
-                <w:rFonts w:ascii="Arial Unicode MS" w:hAnsi="Arial Unicode MS" w:eastAsia="Arial Unicode MS"/>
-                <w:b w:val="0"/>
-                <w:color w:val="1F2937"/>
-                <w:sz w:val="17"/>
-              </w:rPr>
-              <w:t>仅能报告安全前缀、早停与保存区间；无 T=0.4 完整时间/宽度。</w:t>
+              <w:t>三方早停；P3 900/900 盒步接受但性质 Unknown。四方均无 T=0.4 全程结果。</w:t>
             </w:r>
           </w:p>
         </w:tc>
@@ -2329,7 +2299,7 @@
         <w:pStyle w:val="Heading1"/>
       </w:pPr>
       <w:r>
-        <w:t>6  论文方程 QUAD · 新 P3 / Huan / Xiangru</w:t>
+        <w:t>6  论文方程 QUAD · 新四方完整数值时域</w:t>
       </w:r>
     </w:p>
     <w:p>
@@ -2397,7 +2367,7 @@
           </w:tcPr>
           <w:p>
             <w:r>
-              <w:t>P3 / Huan / Xiangru 新全程记录</w:t>
+              <w:t>P3 / Huan / Xiangru / native 新全程记录</w:t>
             </w:r>
           </w:p>
         </w:tc>
@@ -2507,7 +2477,7 @@
           </w:tcPr>
           <w:p>
             <w:r>
-              <w:t>outer wall 1357.555 / 94.583 / 108.018 s；各单次进程</w:t>
+              <w:t>outer wall 1357.555 / 94.583 / 108.018 / 47058.887 s；各单次进程</w:t>
             </w:r>
           </w:p>
         </w:tc>
@@ -2556,7 +2526,7 @@
           </w:tcPr>
           <w:p>
             <w:r>
-              <w:t>三方 1024×1000 全程；P3 全部盒步接受；broken=0</w:t>
+              <w:t>四方 1024×1000 全程；P3 全部盒步接受；native 1,024,000 条完整范围</w:t>
             </w:r>
           </w:p>
         </w:tc>
@@ -2607,7 +2577,7 @@
           </w:tcPr>
           <w:p>
             <w:r>
-              <w:t>P3 [0.9584732146312492,1.0256989633476477]；H/X [0.967434441417146,1.015176258384569]</w:t>
+              <w:t>P3 [0.9584732146312492,1.0256989633476477]；H/X [0.967434441417146,1.015176258384569]；native [0.965771839016746,1.0167484756616678]</w:t>
             </w:r>
           </w:p>
         </w:tc>
@@ -2656,7 +2626,7 @@
           </w:tcPr>
           <w:p>
             <w:r>
-              <w:t>目标 [0.94,1.06]；三方驱动 VERIFIED；P3 端到端严格证书 false</w:t>
+              <w:t>目标 [0.94,1.06]；四方作者 checker VERIFIED；无独立端到端证书</w:t>
             </w:r>
           </w:p>
         </w:tc>
@@ -2669,12 +2639,12 @@
     </w:p>
     <w:p>
       <w:r>
-        <w:t>P3、Huan、Xiangru 各完成 1024×1000 单次全程。P3 1,024,000/1,024,000 盒步接受，wall 1357.555 s，T=5 的 x₃ endpoint union 为 [0.9584732146312492, 1.0256989633476477]；Huan/Xiangru P2 parity 的 wall 为 94.583 / 108.018 s，终点 union 同为 [0.967434441417146, 1.015176258384569]。三方驱动均打印 VERIFIED，但 P3 的 end_to_end_strict_certificate=false。原生仍在运行；不据单次异设备时间作速度排名。</w:t>
+        <w:t>P3、Huan、Xiangru 与 Flow* native 各完成 1024 盒 × 1000 小步的单次全程。四方外层 wall 依次为 1357.555 / 94.583 / 108.018 / 47058.887 s。P3 1,024,000/1,024,000 盒步接受；native ranges.bin 独立重扫有 1,024,000 条唯一有序记录，数值有限、区间非逆序、endpoint 均含于同一步 tube。native T=5 x₃ endpoint union 为 [0.965771839016746,1.0167484756616678]；其原始外层 RESULT 为 completed/exit 0，作者日志打印 VERIFIED。</w:t>
       </w:r>
     </w:p>
     <w:p>
       <w:r>
-        <w:t>P3 为最新严格数值引擎诊断，Huan/Xiangru 为 P2 parity 路径；三方终点区间宽依次为 0.06722574871639841 / 0.04774181696742297 / 0.04774181696742297。较窄区间与作者 verdict 都不构成独立端到端证明。旧作者合同的约 75–80 s Huan、旧 P3 与旧 native 六小时超时来自另一动力学合同，不能直接比较。</w:t>
+        <w:t>P3 的 T=5 x₃ endpoint union 为 [0.9584732146312492,1.0256989633476477]，宽 0.06722574871639841；Huan/Xiangru P2 parity 同为 [0.967434441417146,1.015176258384569]，宽 0.04774181696742297；native 为 [0.965771839016746,1.0167484756616678]，宽 0.0509766366449218。P3 的 end_to_end_strict_certificate=false；保存盒、作者 verdict 和较窄宽度都不是独立端到端证明。native 保存源码只在终时逐盒检查目标，尚无论文 reach-and-remain 的全时证明。四方数值引擎、资源与计时路径不同，各只有一条完整进程，不给速度名次。旧约 75–80 s Huan 属另一动力学合同。</w:t>
       </w:r>
     </w:p>
     <w:p>
@@ -2699,13 +2669,13 @@
         <w:pageBreakBefore/>
       </w:pPr>
       <w:r>
-        <w:t>6.1  P3 QUAD 已保存的 t–x₃ pooled tube</w:t>
+        <w:t>6.1  QUAD native 与 P3 全时 tube 及两方终点</w:t>
       </w:r>
     </w:p>
     <w:p>
       <w:pPr/>
       <w:r>
-        <w:t>每个局部小步只有 1024 个已接受盒的 x₃ 合并上下界，没有逐 lane 二维几何。图示为 1000 个保存 tube 的无插值包络；[0.94,1.06] 只在 T=5 标为终点目标。</w:t>
+        <w:t>native 与 P3 的图线来自各自 1000 个小步的 1024 盒 x₃ pooled tube；Huan/Xiangru 在本次保存证据中仅有 T=5 endpoint 聚合，图中只标终点，不构造其全时曲线。[0.94,1.06] 仅是 T=5 终点目标；native 的 box 投影不恢复 octagon 坐标相关性。</w:t>
       </w:r>
     </w:p>
     <w:p>
@@ -2713,11 +2683,12 @@
         <w:keepNext/>
         <w:jc w:val="center"/>
       </w:pPr>
+      <w:r/>
       <w:r>
         <w:drawing>
           <wp:inline xmlns:a="http://schemas.openxmlformats.org/drawingml/2006/main" xmlns:pic="http://schemas.openxmlformats.org/drawingml/2006/picture">
-            <wp:extent cx="6048000" cy="3382780"/>
-            <wp:docPr id="3" name="Picture 3"/>
+            <wp:extent cx="6048000" cy="2980174"/>
+            <wp:docPr id="7" name="Picture 7"/>
             <wp:cNvGraphicFramePr>
               <a:graphicFrameLocks noChangeAspect="1"/>
             </wp:cNvGraphicFramePr>
@@ -2725,11 +2696,11 @@
               <a:graphicData uri="http://schemas.openxmlformats.org/drawingml/2006/picture">
                 <pic:pic>
                   <pic:nvPicPr>
-                    <pic:cNvPr id="0" name="quad_paper_p3_1024x1000_t_x3_pooled_tube.png"/>
+                    <pic:cNvPr id="0" name="quad_paper_fourway_t_x3_pooled_tube.png"/>
                     <pic:cNvPicPr/>
                   </pic:nvPicPr>
                   <pic:blipFill>
-                    <a:blip r:embed="rId13"/>
+                    <a:blip r:embed="rId17"/>
                     <a:stretch>
                       <a:fillRect/>
                     </a:stretch>
@@ -2737,7 +2708,7 @@
                   <pic:spPr>
                     <a:xfrm>
                       <a:off x="0" y="0"/>
-                      <a:ext cx="6048000" cy="3382780"/>
+                      <a:ext cx="6048000" cy="2980174"/>
                     </a:xfrm>
                     <a:prstGeom prst="rect"/>
                   </pic:spPr>
@@ -2754,7 +2725,7 @@
         <w:keepNext/>
       </w:pPr>
       <w:r>
-        <w:t>图 3  新论文方程 QUAD P3，1024 盒 × 1000 步的 pooled t–x₃ tube；不是逐盒投影。</w:t>
+        <w:t>图 3  论文方程 QUAD：native/P3 完整保存 t–x₃ tube，Huan/Xiangru 只标 T=5 endpoint。</w:t>
       </w:r>
     </w:p>
     <w:p>
@@ -2762,7 +2733,7 @@
         <w:pStyle w:val="Note"/>
       </w:pPr>
       <w:r>
-        <w:t>最后一行 observer 的 x₃ endpoint 与驱动最终 hull 数值略异，图忠实采用保存 JSONL。见 quad_paper_p3_nohash_v1/full50_001/data/observations.jsonl；MATLAB 脚本未实跑。</w:t>
+        <w:t>四方都完成目标数值时域，但只有 native/P3 的逐步 tube 能从现存保存区间重画。图中 P3 终点来自 observer 保存行 [0.9584732146312499,1.0256989643984427]，表中采用驱动最终 hull；两者不可混写。图源及原生范围扫描见 quad_paper_fourway_saved_20261002/SUMMARY.md 与 native_quad_paper_full50_001/SCAN.json；MATLAB 脚本未实跑。</w:t>
       </w:r>
     </w:p>
     <w:p>
@@ -3265,10 +3236,7 @@
     </w:p>
     <w:p>
       <w:r>
-        <w:rPr>
-          <w:rFonts w:ascii="Arial Unicode MS" w:hAnsi="Arial Unicode MS" w:eastAsia="Arial Unicode MS"/>
-        </w:rPr>
-        <w:t>Huan/Xiangru 两条早停运行各有 16,200 个数值接受的 lane-substep 记录，原 driver 在性质早停后返回 0，但外层 wrapper 因未完成 80 步而记失败。native 仅有 14,400 条唯一记录。三者共同保存的前 60 步可对齐到 T=0.30；没有任何一条 T=0.4 完成时间或终点宽度。</w:t>
+        <w:t>Huan/Xiangru 两条早停运行各有 16,200 个数值接受的 lane-substep 记录，原 driver 在性质早停后返回 0，但外层 wrapper 因未完成 80 步而记失败。native 仅有 14,400 条唯一记录。三者共同保存的前 60 步可对齐到 T=0.30；没有任何一条 T=0.4 完成时间或终点宽度。 P3 另有全 225 盒首个 0.02 s 控制期的 4/4 小步、900/900 盒步数值接受；第 3/4 步部分保存区间越过安全带，作者驱动报 Unknown，余下 19 期未尝试。</w:t>
       </w:r>
     </w:p>
     <w:p>
@@ -3415,10 +3383,7 @@
         <w:pStyle w:val="ListBullet"/>
       </w:pPr>
       <w:r>
-        <w:rPr>
-          <w:rFonts w:ascii="Arial Unicode MS" w:hAnsi="Arial Unicode MS" w:eastAsia="Arial Unicode MS"/>
-        </w:rPr>
-        <w:t>DP more：核查早停区间与性质语义；获得独立可靠性证据，保留未观察的 65–80 或 73–80 步为空白。</w:t>
+        <w:t>DP more：四方都缺 T=0.4 全程；保留 native 65–80 步、Huan/Xiangru 73–80 步和 P3 第 2–20 期为未观察，并分别核查早停区间与 P3 首周期 Unknown 的性质语义。</w:t>
       </w:r>
     </w:p>
     <w:p>
@@ -3426,7 +3391,7 @@
         <w:pStyle w:val="ListBullet"/>
       </w:pPr>
       <w:r>
-        <w:t>论文方程 QUAD：Flow* native 全程尚在运行；P3/Huan/Xiangru 的重复计时待做。P3 的已保存 pooled union t–x₃ tube 已绘图，但它不是逐盒投影。</w:t>
+        <w:t>论文方程 QUAD 四方已有单次完整数值时域，native 原始 RESULT 为 completed/exit 0、作者 checker 为 VERIFIED；重复计时和独立端到端证明仍缺。现有四方图只提供 native/P3 全时 tube 及 Huan/Xiangru 终点。</w:t>
       </w:r>
     </w:p>
     <w:p>
@@ -5542,7 +5507,7 @@
     </w:p>
     <w:p>
       <w:r>
-        <w:t>“全程”表示本轮一个方法完成目标数值时域，并不自动表示性质已证明；“诊断”表示短程入口尝试；“早停”或“未知”表示未完成。DP less、ACC、两物理态 Single Pendulum、Attitude 修正后、Docking 各四方及 TORA 原生/P3 等共 25 格有完整记录，距离 64 格矩阵仍有缺口。Docking 原生的 outer RESULT 是 failed/exit 2，原因是 checker Unknown，数值仍完成 400 段。ACC 另有 24 次独立新进程 campaign；其计时中位数不构成稳定速度排名。TORA Huan/Xiangru 虽记录至第 200 小步，但部分盒步拒绝，故列为“未知·前缀”。</w:t>
+        <w:t>“全程”只表示目标数值时域全部推进，不自动证明性质；“诊断”是短前缀，“早停”或“未知”没有完整时域。QUAD、DP less、ACC、两物理态 Single Pendulum、修正后 Attitude、Docking 各有四方全程，TORA remain 原生/P3 也全程，共 26 格。Docking 原生外层 failed/exit 2 源于 checker Unknown，数值仍完成 400 段；ACC 的 24 次独立进程 campaign 不构成稳定速度排名。TORA Huan/Xiangru 虽观察到第 200 小步，但部分盒步拒绝，故列为未知前缀。</w:t>
       </w:r>
     </w:p>
     <w:tbl>
@@ -6564,18 +6529,8 @@
             <w:shd w:fill="F7F8FA"/>
           </w:tcPr>
           <w:p>
-            <w:pPr>
-              <w:spacing w:after="0" w:before="0" w:line="252" w:lineRule="auto"/>
-            </w:pPr>
-            <w:r/>
             <w:r>
-              <w:rPr>
-                <w:rFonts w:ascii="Arial Unicode MS" w:hAnsi="Arial Unicode MS" w:eastAsia="Arial Unicode MS"/>
-                <w:b w:val="0"/>
-                <w:color w:val="1F2937"/>
-                <w:sz w:val="16"/>
-              </w:rPr>
-              <w:t>待</w:t>
+              <w:t>首周期·性质未知</w:t>
             </w:r>
           </w:p>
         </w:tc>
@@ -6648,18 +6603,8 @@
             <w:shd w:fill="F7F8FA"/>
           </w:tcPr>
           <w:p>
-            <w:pPr>
-              <w:spacing w:after="0" w:before="0" w:line="252" w:lineRule="auto"/>
-            </w:pPr>
-            <w:r/>
             <w:r>
-              <w:rPr>
-                <w:rFonts w:ascii="Arial Unicode MS" w:hAnsi="Arial Unicode MS" w:eastAsia="Arial Unicode MS"/>
-                <w:b w:val="0"/>
-                <w:color w:val="1F2937"/>
-                <w:sz w:val="16"/>
-              </w:rPr>
-              <w:t>未知</w:t>
+              <w:t>早停·性质未知</w:t>
             </w:r>
           </w:p>
         </w:tc>
@@ -7034,7 +6979,7 @@
           </w:tcPr>
           <w:p>
             <w:r>
-              <w:t>运行中</w:t>
+              <w:t>全程</w:t>
             </w:r>
           </w:p>
         </w:tc>
@@ -7317,18 +7262,8 @@
             <w:shd w:fill="F7F8FA"/>
           </w:tcPr>
           <w:p>
-            <w:pPr>
-              <w:spacing w:after="0" w:before="0" w:line="252" w:lineRule="auto"/>
-            </w:pPr>
-            <w:r/>
             <w:r>
-              <w:rPr>
-                <w:rFonts w:ascii="Arial Unicode MS" w:hAnsi="Arial Unicode MS" w:eastAsia="Arial Unicode MS"/>
-                <w:b w:val="0"/>
-                <w:color w:val="1F2937"/>
-                <w:sz w:val="16"/>
-              </w:rPr>
-              <w:t>待</w:t>
+              <w:t>全初盒一期</w:t>
             </w:r>
           </w:p>
         </w:tc>

</xml_diff>